<commit_message>
Name Jollof Living and include digital assets and IP in the Helikon offer
Co-authored-by: arena-agent <297053741+arena-agent@users.noreply.github.com>
</commit_message>
<xml_diff>
--- a/docs/Helikon-Consortium-Offer-Jollof-Living.docx
+++ b/docs/Helikon-Consortium-Offer-Jollof-Living.docx
@@ -102,7 +102,7 @@
           <w:color w:val="444444"/>
           <w:sz w:val="22"/>
         </w:rPr>
-        <w:t>100% owners of the company</w:t>
+        <w:t>100% owners of Jollof Living</w:t>
       </w:r>
     </w:p>
     <w:p>
@@ -255,7 +255,7 @@
           <w:color w:val="111111"/>
           <w:sz w:val="20"/>
         </w:rPr>
-        <w:t>We, being the 100% owners, accept Helikon Consortium’s offer of 16 September 2026 to purchase 90% of the company for ₦2.88 billion (US$1.80 million), we retaining 10%, with Mr Chinwike Ogbunugafor as CTO for 18 months at ₦500,000 per month. We acknowledge the offer is final and will not be negotiated further.</w:t>
+        <w:t>We, being the 100% owners of Jollof Living, accept Helikon Consortium’s offer of 16 September 2026 to purchase 90% of Jollof Living, including all digital products and intellectual property listed in that letter, for ₦2.88 billion (US$1.80 million), we retaining 10%, with Mr Chinwike Ogbunugafor as CTO for 18 months at ₦500,000 per month. We acknowledge the offer is final and will not be negotiated further.</w:t>
       </w:r>
     </w:p>
     <w:tbl>

</xml_diff>